<commit_message>
Anexo de trabajo en equipo con responsabilidades por integrante
</commit_message>
<xml_diff>
--- a/entrega/Entrega1_Alerta_prorrogas_SECOP.docx
+++ b/entrega/Entrega1_Alerta_prorrogas_SECOP.docx
@@ -3645,10 +3645,7 @@
     </w:p>
     <w:p>
       <w:r>
-        <w:rPr>
-          <w:highlight w:val="yellow"/>
-        </w:rPr>
-        <w:t>[Completar con las responsabilidades reales de cada integrante; cada una debe poder verificarse con sus commits en el repositorio.]</w:t>
+        <w:t>Cada responsabilidad se soporta con los commits de su autor en el repositorio.</w:t>
       </w:r>
     </w:p>
     <w:tbl>
@@ -3678,7 +3675,7 @@
         </w:trPr>
         <w:tc>
           <w:tcPr>
-            <w:tcW w:type="dxa" w:w="2494"/>
+            <w:tcW w:type="dxa" w:w="2268"/>
             <w:vAlign w:val="top"/>
             <w:shd w:val="clear" w:color="auto" w:fill="011430"/>
           </w:tcPr>
@@ -3699,7 +3696,7 @@
         </w:tc>
         <w:tc>
           <w:tcPr>
-            <w:tcW w:type="dxa" w:w="3742"/>
+            <w:tcW w:type="dxa" w:w="3855"/>
             <w:vAlign w:val="top"/>
             <w:shd w:val="clear" w:color="auto" w:fill="011430"/>
           </w:tcPr>
@@ -3720,7 +3717,7 @@
         </w:tc>
         <w:tc>
           <w:tcPr>
-            <w:tcW w:type="dxa" w:w="2608"/>
+            <w:tcW w:type="dxa" w:w="2721"/>
             <w:vAlign w:val="top"/>
             <w:shd w:val="clear" w:color="auto" w:fill="011430"/>
           </w:tcPr>
@@ -3746,7 +3743,7 @@
         </w:trPr>
         <w:tc>
           <w:tcPr>
-            <w:tcW w:type="dxa" w:w="2494"/>
+            <w:tcW w:type="dxa" w:w="2268"/>
             <w:vAlign w:val="top"/>
             <w:shd w:val="clear" w:color="auto" w:fill="D9D9DE"/>
           </w:tcPr>
@@ -3767,7 +3764,7 @@
         </w:tc>
         <w:tc>
           <w:tcPr>
-            <w:tcW w:type="dxa" w:w="3742"/>
+            <w:tcW w:type="dxa" w:w="3855"/>
             <w:vAlign w:val="top"/>
             <w:shd w:val="clear" w:color="auto" w:fill="D9D9DE"/>
           </w:tcPr>
@@ -3782,13 +3779,13 @@
                 <w:color w:val="28303B"/>
                 <w:sz w:val="21"/>
               </w:rPr>
-              <w:t>[ ]</w:t>
+              <w:t>Análisis de las variables candidatas y sus hipótesis de negocio; revisión de la pregunta de negocio y del alcance</w:t>
             </w:r>
           </w:p>
         </w:tc>
         <w:tc>
           <w:tcPr>
-            <w:tcW w:type="dxa" w:w="2608"/>
+            <w:tcW w:type="dxa" w:w="2721"/>
             <w:vAlign w:val="top"/>
             <w:shd w:val="clear" w:color="auto" w:fill="D9D9DE"/>
           </w:tcPr>
@@ -3803,7 +3800,23 @@
                 <w:color w:val="28303B"/>
                 <w:sz w:val="21"/>
               </w:rPr>
-              <w:t>[ ]</w:t>
+            </w:r>
+            <w:r>
+              <w:rPr>
+                <w:rFonts w:ascii="Consolas" w:hAnsi="Consolas" w:cs="Consolas" w:eastAsia="Consolas"/>
+                <w:color w:val="28303B"/>
+                <w:sz w:val="19"/>
+              </w:rPr>
+              <w:t>reports/hipotesis_variables.md</w:t>
+            </w:r>
+            <w:r>
+              <w:rPr>
+                <w:rFonts w:ascii="Franklin Gothic Book" w:hAnsi="Franklin Gothic Book" w:cs="Franklin Gothic Book" w:eastAsia="Franklin Gothic Book"/>
+                <w:color w:val="28303B"/>
+                <w:sz w:val="21"/>
+                <w:highlight w:val="yellow"/>
+              </w:rPr>
+              <w:t xml:space="preserve"> [commit pendiente]</w:t>
             </w:r>
           </w:p>
         </w:tc>
@@ -3814,7 +3827,7 @@
         </w:trPr>
         <w:tc>
           <w:tcPr>
-            <w:tcW w:type="dxa" w:w="2494"/>
+            <w:tcW w:type="dxa" w:w="2268"/>
             <w:vAlign w:val="top"/>
           </w:tcPr>
           <w:p>
@@ -3834,7 +3847,7 @@
         </w:tc>
         <w:tc>
           <w:tcPr>
-            <w:tcW w:type="dxa" w:w="3742"/>
+            <w:tcW w:type="dxa" w:w="3855"/>
             <w:vAlign w:val="top"/>
           </w:tcPr>
           <w:p>
@@ -3848,13 +3861,13 @@
                 <w:color w:val="28303B"/>
                 <w:sz w:val="21"/>
               </w:rPr>
-              <w:t>[ ]</w:t>
+              <w:t>Selección del problema y de los datos; pipeline de descarga y cruce con DVC; exploración de datos; maqueta del prototipo; redacción del reporte</w:t>
             </w:r>
           </w:p>
         </w:tc>
         <w:tc>
           <w:tcPr>
-            <w:tcW w:type="dxa" w:w="2608"/>
+            <w:tcW w:type="dxa" w:w="2721"/>
             <w:vAlign w:val="top"/>
           </w:tcPr>
           <w:p>
@@ -3868,7 +3881,7 @@
                 <w:color w:val="28303B"/>
                 <w:sz w:val="21"/>
               </w:rPr>
-              <w:t>[ ]</w:t>
+              <w:t>Commits bacbba8, abdc533, a8fe008 y 8ce136e</w:t>
             </w:r>
           </w:p>
         </w:tc>
@@ -3879,7 +3892,7 @@
         </w:trPr>
         <w:tc>
           <w:tcPr>
-            <w:tcW w:type="dxa" w:w="2494"/>
+            <w:tcW w:type="dxa" w:w="2268"/>
             <w:vAlign w:val="top"/>
             <w:shd w:val="clear" w:color="auto" w:fill="D9D9DE"/>
           </w:tcPr>
@@ -3900,7 +3913,7 @@
         </w:tc>
         <w:tc>
           <w:tcPr>
-            <w:tcW w:type="dxa" w:w="3742"/>
+            <w:tcW w:type="dxa" w:w="3855"/>
             <w:vAlign w:val="top"/>
             <w:shd w:val="clear" w:color="auto" w:fill="D9D9DE"/>
           </w:tcPr>
@@ -3915,13 +3928,13 @@
                 <w:color w:val="28303B"/>
                 <w:sz w:val="21"/>
               </w:rPr>
-              <w:t>[ ]</w:t>
+              <w:t>Consolidación y revisión final del reporte; reporte de trabajo en equipo; seguimiento del cronograma y plan de la Entrega 2</w:t>
             </w:r>
           </w:p>
         </w:tc>
         <w:tc>
           <w:tcPr>
-            <w:tcW w:type="dxa" w:w="2608"/>
+            <w:tcW w:type="dxa" w:w="2721"/>
             <w:vAlign w:val="top"/>
             <w:shd w:val="clear" w:color="auto" w:fill="D9D9DE"/>
           </w:tcPr>
@@ -3936,7 +3949,23 @@
                 <w:color w:val="28303B"/>
                 <w:sz w:val="21"/>
               </w:rPr>
-              <w:t>[ ]</w:t>
+            </w:r>
+            <w:r>
+              <w:rPr>
+                <w:rFonts w:ascii="Consolas" w:hAnsi="Consolas" w:cs="Consolas" w:eastAsia="Consolas"/>
+                <w:color w:val="28303B"/>
+                <w:sz w:val="19"/>
+              </w:rPr>
+              <w:t>entrega/trabajo_en_equipo.md</w:t>
+            </w:r>
+            <w:r>
+              <w:rPr>
+                <w:rFonts w:ascii="Franklin Gothic Book" w:hAnsi="Franklin Gothic Book" w:cs="Franklin Gothic Book" w:eastAsia="Franklin Gothic Book"/>
+                <w:color w:val="28303B"/>
+                <w:sz w:val="21"/>
+                <w:highlight w:val="yellow"/>
+              </w:rPr>
+              <w:t xml:space="preserve"> [commit pendiente]</w:t>
             </w:r>
           </w:p>
         </w:tc>

</xml_diff>

<commit_message>
Figuras 7 y 8 actualizadas con el historial vigente
</commit_message>
<xml_diff>
--- a/entrega/Entrega1_Alerta_prorrogas_SECOP.docx
+++ b/entrega/Entrega1_Alerta_prorrogas_SECOP.docx
@@ -3396,7 +3396,7 @@
       <w:r>
         <w:drawing>
           <wp:inline xmlns:a="http://schemas.openxmlformats.org/drawingml/2006/main" xmlns:pic="http://schemas.openxmlformats.org/drawingml/2006/picture">
-            <wp:extent cx="4500000" cy="1340526"/>
+            <wp:extent cx="4500000" cy="1582105"/>
             <wp:docPr id="10" name="Picture 10"/>
             <wp:cNvGraphicFramePr>
               <a:graphicFrameLocks noChangeAspect="1"/>
@@ -3417,7 +3417,7 @@
                   <pic:spPr>
                     <a:xfrm>
                       <a:off x="0" y="0"/>
-                      <a:ext cx="4500000" cy="1340526"/>
+                      <a:ext cx="4500000" cy="1582105"/>
                     </a:xfrm>
                     <a:prstGeom prst="rect"/>
                   </pic:spPr>
@@ -3448,7 +3448,7 @@
           <w:color w:val="28303B"/>
           <w:sz w:val="18"/>
         </w:rPr>
-        <w:t>Historial de commits, remoto DVC configurado y estado del pipeline (dvc status).</w:t>
+        <w:t>Salida de git log, cat .dvc/config y dvc status: historial de commits, remoto DVC configurado y pipeline al día.</w:t>
       </w:r>
     </w:p>
     <w:p>
@@ -3881,7 +3881,7 @@
                 <w:color w:val="28303B"/>
                 <w:sz w:val="21"/>
               </w:rPr>
-              <w:t>Commits 86fc117, 4acbe4d, 49da38a, 48053ab, 246af20 y 32fcf56</w:t>
+              <w:t>Commits 86fc117, 4acbe4d, 49da38a, 48053ab, 246af20, 32fcf56 y 4a07b21</w:t>
             </w:r>
           </w:p>
         </w:tc>

</xml_diff>

<commit_message>
Anexo y figuras 7 y 8 con los commits de Julián
</commit_message>
<xml_diff>
--- a/entrega/Entrega1_Alerta_prorrogas_SECOP.docx
+++ b/entrega/Entrega1_Alerta_prorrogas_SECOP.docx
@@ -3396,7 +3396,7 @@
       <w:r>
         <w:drawing>
           <wp:inline xmlns:a="http://schemas.openxmlformats.org/drawingml/2006/main" xmlns:pic="http://schemas.openxmlformats.org/drawingml/2006/picture">
-            <wp:extent cx="4500000" cy="1582105"/>
+            <wp:extent cx="4500000" cy="1662632"/>
             <wp:docPr id="10" name="Picture 10"/>
             <wp:cNvGraphicFramePr>
               <a:graphicFrameLocks noChangeAspect="1"/>
@@ -3417,7 +3417,7 @@
                   <pic:spPr>
                     <a:xfrm>
                       <a:off x="0" y="0"/>
-                      <a:ext cx="4500000" cy="1582105"/>
+                      <a:ext cx="4500000" cy="1662632"/>
                     </a:xfrm>
                     <a:prstGeom prst="rect"/>
                   </pic:spPr>
@@ -3814,9 +3814,24 @@
                 <w:rFonts w:ascii="Franklin Gothic Book" w:hAnsi="Franklin Gothic Book" w:cs="Franklin Gothic Book" w:eastAsia="Franklin Gothic Book"/>
                 <w:color w:val="28303B"/>
                 <w:sz w:val="21"/>
-                <w:highlight w:val="yellow"/>
               </w:rPr>
-              <w:t xml:space="preserve"> [commit pendiente]</w:t>
+              <w:t xml:space="preserve"> (commit af83e36) y </w:t>
+            </w:r>
+            <w:r>
+              <w:rPr>
+                <w:rFonts w:ascii="Consolas" w:hAnsi="Consolas" w:cs="Consolas" w:eastAsia="Consolas"/>
+                <w:color w:val="28303B"/>
+                <w:sz w:val="19"/>
+              </w:rPr>
+              <w:t>reports/revision_pregunta_alcance.md</w:t>
+            </w:r>
+            <w:r>
+              <w:rPr>
+                <w:rFonts w:ascii="Franklin Gothic Book" w:hAnsi="Franklin Gothic Book" w:cs="Franklin Gothic Book" w:eastAsia="Franklin Gothic Book"/>
+                <w:color w:val="28303B"/>
+                <w:sz w:val="21"/>
+              </w:rPr>
+              <w:t xml:space="preserve"> (commit 9b7b73f)</w:t>
             </w:r>
           </w:p>
         </w:tc>
@@ -3881,7 +3896,7 @@
                 <w:color w:val="28303B"/>
                 <w:sz w:val="21"/>
               </w:rPr>
-              <w:t>Commits 86fc117, 4acbe4d, 49da38a, 48053ab, 246af20, 32fcf56 y 4a07b21</w:t>
+              <w:t>Commits 86fc117, 4acbe4d, 49da38a, 48053ab, 246af20, 32fcf56, 4a07b21, 04130b2 y b7350f5</w:t>
             </w:r>
           </w:p>
         </w:tc>

</xml_diff>

<commit_message>
Anexo completo con los commits de Leydi y la coordinación del equipo
</commit_message>
<xml_diff>
--- a/entrega/Entrega1_Alerta_prorrogas_SECOP.docx
+++ b/entrega/Entrega1_Alerta_prorrogas_SECOP.docx
@@ -3978,9 +3978,8 @@
                 <w:rFonts w:ascii="Franklin Gothic Book" w:hAnsi="Franklin Gothic Book" w:cs="Franklin Gothic Book" w:eastAsia="Franklin Gothic Book"/>
                 <w:color w:val="28303B"/>
                 <w:sz w:val="21"/>
-                <w:highlight w:val="yellow"/>
               </w:rPr>
-              <w:t xml:space="preserve"> [commit pendiente]</w:t>
+              <w:t xml:space="preserve"> (commits 902922e y ab45ff7)</w:t>
             </w:r>
           </w:p>
         </w:tc>
@@ -3999,10 +3998,17 @@
         <w:t xml:space="preserve">Coordinación: </w:t>
       </w:r>
       <w:r>
+        <w:t xml:space="preserve">grupo de WhatsApp del equipo y repositorio compartido en GitHub. El plan de la Entrega 2, con responsables y fechas internas, está en </w:t>
+      </w:r>
+      <w:r>
         <w:rPr>
-          <w:highlight w:val="yellow"/>
+          <w:rFonts w:ascii="Consolas" w:hAnsi="Consolas" w:cs="Consolas" w:eastAsia="Consolas"/>
+          <w:sz w:val="21"/>
         </w:rPr>
-        <w:t>[reuniones, fechas de revisión interna y canal usado].</w:t>
+        <w:t>entrega/trabajo_en_equipo.md</w:t>
+      </w:r>
+      <w:r>
+        <w:t>.</w:t>
       </w:r>
     </w:p>
     <w:sectPr>

</xml_diff>

<commit_message>
Reporte en 10 páginas con enlaces, reporte de trabajo en equipo aparte y enlace a los datos
</commit_message>
<xml_diff>
--- a/entrega/Entrega1_Alerta_prorrogas_SECOP.docx
+++ b/entrega/Entrega1_Alerta_prorrogas_SECOP.docx
@@ -2465,7 +2465,20 @@
     </w:p>
     <w:p>
       <w:r>
-        <w:t>El prototipo tiene dos pantallas que responden a la pregunta de negocio: una evalúa el riesgo de un contrato a través de la API del modelo (predictivo) y la otra muestra el panorama descriptivo para orientar la vigilancia. La maqueta navegable está publicada en canaranjom.github.io/secop-alerta-prorrogas.</w:t>
+        <w:t xml:space="preserve">El prototipo tiene dos pantallas que responden a la pregunta de negocio: una evalúa el riesgo de un contrato a través de la API del modelo (predictivo) y la otra muestra el panorama descriptivo para orientar la vigilancia. La maqueta navegable está publicada en </w:t>
+      </w:r>
+      <w:hyperlink r:id="rId16">
+        <w:r>
+          <w:rPr>
+            <w:rFonts w:ascii="Franklin Gothic Book" w:hAnsi="Franklin Gothic Book" w:cs="Franklin Gothic Book"/>
+            <w:color w:val="0563C1"/>
+            <w:u w:val="single"/>
+          </w:rPr>
+          <w:t xml:space="preserve">https://canaranjom.github.io/secop-alerta-prorrogas</w:t>
+        </w:r>
+      </w:hyperlink>
+      <w:r>
+        <w:t>.</w:t>
       </w:r>
     </w:p>
     <w:p>
@@ -2490,7 +2503,7 @@
                     <pic:cNvPicPr/>
                   </pic:nvPicPr>
                   <pic:blipFill>
-                    <a:blip r:embed="rId16"/>
+                    <a:blip r:embed="rId17"/>
                     <a:stretch>
                       <a:fillRect/>
                     </a:stretch>
@@ -2607,7 +2620,7 @@
                     <pic:cNvPicPr/>
                   </pic:nvPicPr>
                   <pic:blipFill>
-                    <a:blip r:embed="rId17"/>
+                    <a:blip r:embed="rId18"/>
                     <a:stretch>
                       <a:fillRect/>
                     </a:stretch>
@@ -2682,7 +2695,7 @@
                     <pic:cNvPicPr/>
                   </pic:nvPicPr>
                   <pic:blipFill>
-                    <a:blip r:embed="rId18"/>
+                    <a:blip r:embed="rId19"/>
                     <a:stretch>
                       <a:fillRect/>
                     </a:stretch>
@@ -2754,9 +2767,16 @@
         </w:rPr>
         <w:t xml:space="preserve">Repositorio: </w:t>
       </w:r>
-      <w:r>
-        <w:t>github.com/canaranjom/secop-alerta-prorrogas</w:t>
-      </w:r>
+      <w:hyperlink r:id="rId20">
+        <w:r>
+          <w:rPr>
+            <w:rFonts w:ascii="Franklin Gothic Book" w:hAnsi="Franklin Gothic Book" w:cs="Franklin Gothic Book"/>
+            <w:color w:val="0563C1"/>
+            <w:u w:val="single"/>
+          </w:rPr>
+          <w:t xml:space="preserve">https://github.com/canaranjom/secop-alerta-prorrogas</w:t>
+        </w:r>
+      </w:hyperlink>
     </w:p>
     <w:p>
       <w:pPr>
@@ -2768,9 +2788,37 @@
         </w:rPr>
         <w:t xml:space="preserve">Maqueta publicada: </w:t>
       </w:r>
+      <w:hyperlink r:id="rId16">
+        <w:r>
+          <w:rPr>
+            <w:rFonts w:ascii="Franklin Gothic Book" w:hAnsi="Franklin Gothic Book" w:cs="Franklin Gothic Book"/>
+            <w:color w:val="0563C1"/>
+            <w:u w:val="single"/>
+          </w:rPr>
+          <w:t xml:space="preserve">https://canaranjom.github.io/secop-alerta-prorrogas</w:t>
+        </w:r>
+      </w:hyperlink>
+    </w:p>
+    <w:p>
+      <w:pPr>
+        <w:pStyle w:val="ListBullet"/>
+      </w:pPr>
       <w:r>
-        <w:t>canaranjom.github.io/secop-alerta-prorrogas</w:t>
+        <w:rPr>
+          <w:rFonts w:ascii="Franklin Gothic Medium" w:hAnsi="Franklin Gothic Medium" w:cs="Franklin Gothic Medium" w:eastAsia="Franklin Gothic Medium"/>
+        </w:rPr>
+        <w:t xml:space="preserve">Datos (crudos y procesados): </w:t>
       </w:r>
+      <w:hyperlink r:id="rId21">
+        <w:r>
+          <w:rPr>
+            <w:rFonts w:ascii="Franklin Gothic Book" w:hAnsi="Franklin Gothic Book" w:cs="Franklin Gothic Book"/>
+            <w:color w:val="0563C1"/>
+            <w:u w:val="single"/>
+          </w:rPr>
+          <w:t xml:space="preserve">Google Drive – secop-alerta-prorrogas-datos</w:t>
+        </w:r>
+      </w:hyperlink>
     </w:p>
     <w:p>
       <w:r>
@@ -2780,7 +2828,7 @@
         <w:t xml:space="preserve">Por qué DVC: </w:t>
       </w:r>
       <w:r>
-        <w:t>los datos pesan cerca de 330 MB y GitHub no acepta archivos de más de 100 MB. DVC guarda en el repositorio solo la huella de cada archivo (</w:t>
+        <w:t>los datos pesan cerca de 670 MB y GitHub no acepta archivos de más de 100 MB. DVC guarda en el repositorio solo la huella de cada archivo (</w:t>
       </w:r>
       <w:r>
         <w:rPr>
@@ -2790,17 +2838,7 @@
         <w:t>dvc.lock</w:t>
       </w:r>
       <w:r>
-        <w:t xml:space="preserve">) y deja los datos en un almacenamiento aparte, que en esta entrega es una carpeta local configurada como remoto. Cualquier integrante obtiene la versión exacta con </w:t>
-      </w:r>
-      <w:r>
-        <w:rPr>
-          <w:rFonts w:ascii="Consolas" w:hAnsi="Consolas" w:cs="Consolas" w:eastAsia="Consolas"/>
-          <w:sz w:val="21"/>
-        </w:rPr>
-        <w:t>dvc pull</w:t>
-      </w:r>
-      <w:r>
-        <w:t xml:space="preserve"> o la regenera desde la API con </w:t>
+        <w:t xml:space="preserve">) y deja los datos en un almacenamiento aparte, que en esta entrega es una carpeta local configurada como remoto; para la entrega, la misma versión está en la carpeta de Drive. También se regeneran desde la API con </w:t>
       </w:r>
       <w:r>
         <w:rPr>
@@ -3312,7 +3350,7 @@
                 <w:color w:val="28303B"/>
                 <w:sz w:val="21"/>
               </w:rPr>
-              <w:t>Este reporte</w:t>
+              <w:t>Este reporte y el reporte de trabajo en equipo</w:t>
             </w:r>
           </w:p>
         </w:tc>
@@ -3345,7 +3383,7 @@
                     <pic:cNvPicPr/>
                   </pic:nvPicPr>
                   <pic:blipFill>
-                    <a:blip r:embed="rId19"/>
+                    <a:blip r:embed="rId22"/>
                     <a:stretch>
                       <a:fillRect/>
                     </a:stretch>
@@ -3409,7 +3447,7 @@
                     <pic:cNvPicPr/>
                   </pic:nvPicPr>
                   <pic:blipFill>
-                    <a:blip r:embed="rId20"/>
+                    <a:blip r:embed="rId23"/>
                     <a:stretch>
                       <a:fillRect/>
                     </a:stretch>
@@ -3627,388 +3665,6 @@
       </w:pPr>
       <w:r>
         <w:t>Maestría en Inteligencia Analítica de Datos (MIAD). (2026). Proyecto – Entrega 1. Despliegue de Soluciones Analíticas [Material de curso]. Universidad de los Andes.</w:t>
-      </w:r>
-    </w:p>
-    <w:p>
-      <w:r>
-        <w:br w:type="page"/>
-      </w:r>
-    </w:p>
-    <w:p>
-      <w:pPr>
-        <w:pStyle w:val="Heading1"/>
-        <w:jc w:val="center"/>
-      </w:pPr>
-      <w:r>
-        <w:t>ANEXO. REPORTE DE TRABAJO EN EQUIPO</w:t>
-      </w:r>
-    </w:p>
-    <w:p>
-      <w:r>
-        <w:t>Cada responsabilidad se soporta con los commits de su autor en el repositorio.</w:t>
-      </w:r>
-    </w:p>
-    <w:tbl>
-      <w:tblPr>
-        <w:tblW w:type="auto" w:w="0"/>
-        <w:jc w:val="center"/>
-        <w:tblLayout w:type="fixed"/>
-        <w:tblLook w:firstColumn="1" w:firstRow="1" w:lastColumn="0" w:lastRow="0" w:noHBand="0" w:noVBand="1" w:val="04A0"/>
-        <w:tblBorders>
-          <w:top w:val="single" w:sz="4" w:color="7F7F7F"/>
-          <w:left w:val="single" w:sz="4" w:color="7F7F7F"/>
-          <w:bottom w:val="single" w:sz="4" w:color="7F7F7F"/>
-          <w:right w:val="single" w:sz="4" w:color="7F7F7F"/>
-          <w:insideH w:val="single" w:sz="4" w:color="7F7F7F"/>
-          <w:insideV w:val="single" w:sz="4" w:color="7F7F7F"/>
-        </w:tblBorders>
-      </w:tblPr>
-      <w:tblGrid>
-        <w:gridCol w:w="2946"/>
-        <w:gridCol w:w="2946"/>
-        <w:gridCol w:w="2946"/>
-      </w:tblGrid>
-      <w:tr>
-        <w:trPr>
-          <w:tblHeader/>
-          <w:cantSplit/>
-        </w:trPr>
-        <w:tc>
-          <w:tcPr>
-            <w:tcW w:type="dxa" w:w="2268"/>
-            <w:vAlign w:val="top"/>
-            <w:shd w:val="clear" w:color="auto" w:fill="011430"/>
-          </w:tcPr>
-          <w:p>
-            <w:pPr>
-              <w:spacing w:after="0"/>
-              <w:jc w:val="left"/>
-            </w:pPr>
-            <w:r>
-              <w:rPr>
-                <w:rFonts w:ascii="Franklin Gothic Medium" w:hAnsi="Franklin Gothic Medium" w:cs="Franklin Gothic Medium" w:eastAsia="Franklin Gothic Medium"/>
-                <w:color w:val="FFFFFF"/>
-                <w:sz w:val="21"/>
-              </w:rPr>
-              <w:t>Integrante</w:t>
-            </w:r>
-          </w:p>
-        </w:tc>
-        <w:tc>
-          <w:tcPr>
-            <w:tcW w:type="dxa" w:w="3855"/>
-            <w:vAlign w:val="top"/>
-            <w:shd w:val="clear" w:color="auto" w:fill="011430"/>
-          </w:tcPr>
-          <w:p>
-            <w:pPr>
-              <w:spacing w:after="0"/>
-              <w:jc w:val="left"/>
-            </w:pPr>
-            <w:r>
-              <w:rPr>
-                <w:rFonts w:ascii="Franklin Gothic Medium" w:hAnsi="Franklin Gothic Medium" w:cs="Franklin Gothic Medium" w:eastAsia="Franklin Gothic Medium"/>
-                <w:color w:val="FFFFFF"/>
-                <w:sz w:val="21"/>
-              </w:rPr>
-              <w:t>Responsabilidades</w:t>
-            </w:r>
-          </w:p>
-        </w:tc>
-        <w:tc>
-          <w:tcPr>
-            <w:tcW w:type="dxa" w:w="2721"/>
-            <w:vAlign w:val="top"/>
-            <w:shd w:val="clear" w:color="auto" w:fill="011430"/>
-          </w:tcPr>
-          <w:p>
-            <w:pPr>
-              <w:spacing w:after="0"/>
-              <w:jc w:val="left"/>
-            </w:pPr>
-            <w:r>
-              <w:rPr>
-                <w:rFonts w:ascii="Franklin Gothic Medium" w:hAnsi="Franklin Gothic Medium" w:cs="Franklin Gothic Medium" w:eastAsia="Franklin Gothic Medium"/>
-                <w:color w:val="FFFFFF"/>
-                <w:sz w:val="21"/>
-              </w:rPr>
-              <w:t>Evidencia en el repositorio</w:t>
-            </w:r>
-          </w:p>
-        </w:tc>
-      </w:tr>
-      <w:tr>
-        <w:trPr>
-          <w:cantSplit/>
-        </w:trPr>
-        <w:tc>
-          <w:tcPr>
-            <w:tcW w:type="dxa" w:w="2268"/>
-            <w:vAlign w:val="top"/>
-            <w:shd w:val="clear" w:color="auto" w:fill="D9D9DE"/>
-          </w:tcPr>
-          <w:p>
-            <w:pPr>
-              <w:spacing w:after="0"/>
-              <w:jc w:val="left"/>
-            </w:pPr>
-            <w:r>
-              <w:rPr>
-                <w:rFonts w:ascii="Franklin Gothic Medium" w:hAnsi="Franklin Gothic Medium" w:cs="Franklin Gothic Medium" w:eastAsia="Franklin Gothic Medium"/>
-                <w:color w:val="000000"/>
-                <w:sz w:val="21"/>
-              </w:rPr>
-              <w:t>Julián David Castañeda Plazas</w:t>
-            </w:r>
-          </w:p>
-        </w:tc>
-        <w:tc>
-          <w:tcPr>
-            <w:tcW w:type="dxa" w:w="3855"/>
-            <w:vAlign w:val="top"/>
-            <w:shd w:val="clear" w:color="auto" w:fill="D9D9DE"/>
-          </w:tcPr>
-          <w:p>
-            <w:pPr>
-              <w:spacing w:after="0"/>
-              <w:jc w:val="left"/>
-            </w:pPr>
-            <w:r>
-              <w:rPr>
-                <w:rFonts w:ascii="Franklin Gothic Book" w:hAnsi="Franklin Gothic Book" w:cs="Franklin Gothic Book" w:eastAsia="Franklin Gothic Book"/>
-                <w:color w:val="28303B"/>
-                <w:sz w:val="21"/>
-              </w:rPr>
-              <w:t>Análisis de las variables candidatas y sus hipótesis de negocio; revisión de la pregunta de negocio y del alcance</w:t>
-            </w:r>
-          </w:p>
-        </w:tc>
-        <w:tc>
-          <w:tcPr>
-            <w:tcW w:type="dxa" w:w="2721"/>
-            <w:vAlign w:val="top"/>
-            <w:shd w:val="clear" w:color="auto" w:fill="D9D9DE"/>
-          </w:tcPr>
-          <w:p>
-            <w:pPr>
-              <w:spacing w:after="0"/>
-              <w:jc w:val="left"/>
-            </w:pPr>
-            <w:r>
-              <w:rPr>
-                <w:rFonts w:ascii="Franklin Gothic Book" w:hAnsi="Franklin Gothic Book" w:cs="Franklin Gothic Book" w:eastAsia="Franklin Gothic Book"/>
-                <w:color w:val="28303B"/>
-                <w:sz w:val="21"/>
-              </w:rPr>
-            </w:r>
-            <w:r>
-              <w:rPr>
-                <w:rFonts w:ascii="Consolas" w:hAnsi="Consolas" w:cs="Consolas" w:eastAsia="Consolas"/>
-                <w:color w:val="28303B"/>
-                <w:sz w:val="19"/>
-              </w:rPr>
-              <w:t>reports/hipotesis_variables.md</w:t>
-            </w:r>
-            <w:r>
-              <w:rPr>
-                <w:rFonts w:ascii="Franklin Gothic Book" w:hAnsi="Franklin Gothic Book" w:cs="Franklin Gothic Book" w:eastAsia="Franklin Gothic Book"/>
-                <w:color w:val="28303B"/>
-                <w:sz w:val="21"/>
-              </w:rPr>
-              <w:t xml:space="preserve"> (commit af83e36) y </w:t>
-            </w:r>
-            <w:r>
-              <w:rPr>
-                <w:rFonts w:ascii="Consolas" w:hAnsi="Consolas" w:cs="Consolas" w:eastAsia="Consolas"/>
-                <w:color w:val="28303B"/>
-                <w:sz w:val="19"/>
-              </w:rPr>
-              <w:t>reports/revision_pregunta_alcance.md</w:t>
-            </w:r>
-            <w:r>
-              <w:rPr>
-                <w:rFonts w:ascii="Franklin Gothic Book" w:hAnsi="Franklin Gothic Book" w:cs="Franklin Gothic Book" w:eastAsia="Franklin Gothic Book"/>
-                <w:color w:val="28303B"/>
-                <w:sz w:val="21"/>
-              </w:rPr>
-              <w:t xml:space="preserve"> (commit 9b7b73f)</w:t>
-            </w:r>
-          </w:p>
-        </w:tc>
-      </w:tr>
-      <w:tr>
-        <w:trPr>
-          <w:cantSplit/>
-        </w:trPr>
-        <w:tc>
-          <w:tcPr>
-            <w:tcW w:type="dxa" w:w="2268"/>
-            <w:vAlign w:val="top"/>
-          </w:tcPr>
-          <w:p>
-            <w:pPr>
-              <w:spacing w:after="0"/>
-              <w:jc w:val="left"/>
-            </w:pPr>
-            <w:r>
-              <w:rPr>
-                <w:rFonts w:ascii="Franklin Gothic Medium" w:hAnsi="Franklin Gothic Medium" w:cs="Franklin Gothic Medium" w:eastAsia="Franklin Gothic Medium"/>
-                <w:color w:val="000000"/>
-                <w:sz w:val="21"/>
-              </w:rPr>
-              <w:t>Camilo Arlex Naranjo Mejía</w:t>
-            </w:r>
-          </w:p>
-        </w:tc>
-        <w:tc>
-          <w:tcPr>
-            <w:tcW w:type="dxa" w:w="3855"/>
-            <w:vAlign w:val="top"/>
-          </w:tcPr>
-          <w:p>
-            <w:pPr>
-              <w:spacing w:after="0"/>
-              <w:jc w:val="left"/>
-            </w:pPr>
-            <w:r>
-              <w:rPr>
-                <w:rFonts w:ascii="Franklin Gothic Book" w:hAnsi="Franklin Gothic Book" w:cs="Franklin Gothic Book" w:eastAsia="Franklin Gothic Book"/>
-                <w:color w:val="28303B"/>
-                <w:sz w:val="21"/>
-              </w:rPr>
-              <w:t>Selección del problema y de los datos; pipeline de descarga y cruce con DVC; exploración de datos; maqueta del prototipo; redacción del reporte</w:t>
-            </w:r>
-          </w:p>
-        </w:tc>
-        <w:tc>
-          <w:tcPr>
-            <w:tcW w:type="dxa" w:w="2721"/>
-            <w:vAlign w:val="top"/>
-          </w:tcPr>
-          <w:p>
-            <w:pPr>
-              <w:spacing w:after="0"/>
-              <w:jc w:val="left"/>
-            </w:pPr>
-            <w:r>
-              <w:rPr>
-                <w:rFonts w:ascii="Franklin Gothic Book" w:hAnsi="Franklin Gothic Book" w:cs="Franklin Gothic Book" w:eastAsia="Franklin Gothic Book"/>
-                <w:color w:val="28303B"/>
-                <w:sz w:val="21"/>
-              </w:rPr>
-              <w:t>Commits 86fc117, 4acbe4d, 49da38a, 48053ab, 246af20, 32fcf56, 4a07b21, 04130b2 y b7350f5</w:t>
-            </w:r>
-          </w:p>
-        </w:tc>
-      </w:tr>
-      <w:tr>
-        <w:trPr>
-          <w:cantSplit/>
-        </w:trPr>
-        <w:tc>
-          <w:tcPr>
-            <w:tcW w:type="dxa" w:w="2268"/>
-            <w:vAlign w:val="top"/>
-            <w:shd w:val="clear" w:color="auto" w:fill="D9D9DE"/>
-          </w:tcPr>
-          <w:p>
-            <w:pPr>
-              <w:spacing w:after="0"/>
-              <w:jc w:val="left"/>
-            </w:pPr>
-            <w:r>
-              <w:rPr>
-                <w:rFonts w:ascii="Franklin Gothic Medium" w:hAnsi="Franklin Gothic Medium" w:cs="Franklin Gothic Medium" w:eastAsia="Franklin Gothic Medium"/>
-                <w:color w:val="000000"/>
-                <w:sz w:val="21"/>
-              </w:rPr>
-              <w:t>Leydi Patricia Pichón Pacheco</w:t>
-            </w:r>
-          </w:p>
-        </w:tc>
-        <w:tc>
-          <w:tcPr>
-            <w:tcW w:type="dxa" w:w="3855"/>
-            <w:vAlign w:val="top"/>
-            <w:shd w:val="clear" w:color="auto" w:fill="D9D9DE"/>
-          </w:tcPr>
-          <w:p>
-            <w:pPr>
-              <w:spacing w:after="0"/>
-              <w:jc w:val="left"/>
-            </w:pPr>
-            <w:r>
-              <w:rPr>
-                <w:rFonts w:ascii="Franklin Gothic Book" w:hAnsi="Franklin Gothic Book" w:cs="Franklin Gothic Book" w:eastAsia="Franklin Gothic Book"/>
-                <w:color w:val="28303B"/>
-                <w:sz w:val="21"/>
-              </w:rPr>
-              <w:t>Consolidación y revisión final del reporte; reporte de trabajo en equipo; seguimiento del cronograma y plan de la Entrega 2</w:t>
-            </w:r>
-          </w:p>
-        </w:tc>
-        <w:tc>
-          <w:tcPr>
-            <w:tcW w:type="dxa" w:w="2721"/>
-            <w:vAlign w:val="top"/>
-            <w:shd w:val="clear" w:color="auto" w:fill="D9D9DE"/>
-          </w:tcPr>
-          <w:p>
-            <w:pPr>
-              <w:spacing w:after="0"/>
-              <w:jc w:val="left"/>
-            </w:pPr>
-            <w:r>
-              <w:rPr>
-                <w:rFonts w:ascii="Franklin Gothic Book" w:hAnsi="Franklin Gothic Book" w:cs="Franklin Gothic Book" w:eastAsia="Franklin Gothic Book"/>
-                <w:color w:val="28303B"/>
-                <w:sz w:val="21"/>
-              </w:rPr>
-            </w:r>
-            <w:r>
-              <w:rPr>
-                <w:rFonts w:ascii="Consolas" w:hAnsi="Consolas" w:cs="Consolas" w:eastAsia="Consolas"/>
-                <w:color w:val="28303B"/>
-                <w:sz w:val="19"/>
-              </w:rPr>
-              <w:t>entrega/trabajo_en_equipo.md</w:t>
-            </w:r>
-            <w:r>
-              <w:rPr>
-                <w:rFonts w:ascii="Franklin Gothic Book" w:hAnsi="Franklin Gothic Book" w:cs="Franklin Gothic Book" w:eastAsia="Franklin Gothic Book"/>
-                <w:color w:val="28303B"/>
-                <w:sz w:val="21"/>
-              </w:rPr>
-              <w:t xml:space="preserve"> (commits 902922e y ab45ff7)</w:t>
-            </w:r>
-          </w:p>
-        </w:tc>
-      </w:tr>
-    </w:tbl>
-    <w:p>
-      <w:pPr>
-        <w:spacing w:after="0"/>
-      </w:pPr>
-    </w:p>
-    <w:p>
-      <w:r>
-        <w:rPr>
-          <w:rFonts w:ascii="Franklin Gothic Medium" w:hAnsi="Franklin Gothic Medium" w:cs="Franklin Gothic Medium" w:eastAsia="Franklin Gothic Medium"/>
-        </w:rPr>
-        <w:t xml:space="preserve">Coordinación: </w:t>
-      </w:r>
-      <w:r>
-        <w:t xml:space="preserve">grupo de WhatsApp del equipo y repositorio compartido en GitHub. El plan de la Entrega 2, con responsables y fechas internas, está en </w:t>
-      </w:r>
-      <w:r>
-        <w:rPr>
-          <w:rFonts w:ascii="Consolas" w:hAnsi="Consolas" w:cs="Consolas" w:eastAsia="Consolas"/>
-          <w:sz w:val="21"/>
-        </w:rPr>
-        <w:t>entrega/trabajo_en_equipo.md</w:t>
-      </w:r>
-      <w:r>
-        <w:t>.</w:t>
       </w:r>
     </w:p>
     <w:sectPr>

</xml_diff>